<commit_message>
feat(post-quantum-cryptography): update labs formatting. Fix lab and presentation
</commit_message>
<xml_diff>
--- a/Year 1/Постквантова криптографія/UA/2026/Labs/Лабораторна_1.docx
+++ b/Year 1/Постквантова криптографія/UA/2026/Labs/Лабораторна_1.docx
@@ -616,12 +616,6 @@
         <w:gridCol w:w="9354"/>
       </w:tblGrid>
       <w:tr>
-        <w:tblPrEx>
-          <w:tblCellMar>
-            <w:top w:w="0" w:type="dxa"/>
-            <w:bottom w:w="0" w:type="dxa"/>
-          </w:tblCellMar>
-        </w:tblPrEx>
         <w:tc>
           <w:tcPr>
             <w:tcW w:w="0" w:type="auto"/>
@@ -771,12 +765,6 @@
         <w:gridCol w:w="9354"/>
       </w:tblGrid>
       <w:tr>
-        <w:tblPrEx>
-          <w:tblCellMar>
-            <w:top w:w="0" w:type="dxa"/>
-            <w:bottom w:w="0" w:type="dxa"/>
-          </w:tblCellMar>
-        </w:tblPrEx>
         <w:tc>
           <w:tcPr>
             <w:tcW w:w="0" w:type="auto"/>
@@ -804,12 +792,6 @@
         </w:tc>
       </w:tr>
       <w:tr>
-        <w:tblPrEx>
-          <w:tblCellMar>
-            <w:top w:w="0" w:type="dxa"/>
-            <w:bottom w:w="0" w:type="dxa"/>
-          </w:tblCellMar>
-        </w:tblPrEx>
         <w:tc>
           <w:tcPr>
             <w:tcW w:w="0" w:type="auto"/>
@@ -837,12 +819,6 @@
         </w:tc>
       </w:tr>
       <w:tr>
-        <w:tblPrEx>
-          <w:tblCellMar>
-            <w:top w:w="0" w:type="dxa"/>
-            <w:bottom w:w="0" w:type="dxa"/>
-          </w:tblCellMar>
-        </w:tblPrEx>
         <w:tc>
           <w:tcPr>
             <w:tcW w:w="0" w:type="auto"/>
@@ -870,37 +846,25 @@
         </w:tc>
       </w:tr>
       <w:tr>
-        <w:tblPrEx>
-          <w:tblCellMar>
-            <w:top w:w="0" w:type="dxa"/>
-            <w:bottom w:w="0" w:type="dxa"/>
-          </w:tblCellMar>
-        </w:tblPrEx>
-        <w:tc>
-          <w:tcPr>
-            <w:tcW w:w="0" w:type="auto"/>
-            <w:shd w:val="solid" w:color="F2F2F2" w:fill="F2F2F2"/>
-            <w:tcMar>
-              <w:top w:w="20" w:type="dxa"/>
-              <w:left w:w="120" w:type="dxa"/>
-              <w:bottom w:w="20" w:type="dxa"/>
-              <w:right w:w="120" w:type="dxa"/>
-            </w:tcMar>
-          </w:tcPr>
-          <w:p>
-            <w:pPr>
-              <w:spacing w:line="276" w:lineRule="auto"/>
-            </w:pPr>
-          </w:p>
-        </w:tc>
-      </w:tr>
-      <w:tr>
-        <w:tblPrEx>
-          <w:tblCellMar>
-            <w:top w:w="0" w:type="dxa"/>
-            <w:bottom w:w="0" w:type="dxa"/>
-          </w:tblCellMar>
-        </w:tblPrEx>
+        <w:tc>
+          <w:tcPr>
+            <w:tcW w:w="0" w:type="auto"/>
+            <w:shd w:val="solid" w:color="F2F2F2" w:fill="F2F2F2"/>
+            <w:tcMar>
+              <w:top w:w="20" w:type="dxa"/>
+              <w:left w:w="120" w:type="dxa"/>
+              <w:bottom w:w="20" w:type="dxa"/>
+              <w:right w:w="120" w:type="dxa"/>
+            </w:tcMar>
+          </w:tcPr>
+          <w:p>
+            <w:pPr>
+              <w:spacing w:line="276" w:lineRule="auto"/>
+            </w:pPr>
+          </w:p>
+        </w:tc>
+      </w:tr>
+      <w:tr>
         <w:tc>
           <w:tcPr>
             <w:tcW w:w="0" w:type="auto"/>
@@ -928,12 +892,6 @@
         </w:tc>
       </w:tr>
       <w:tr>
-        <w:tblPrEx>
-          <w:tblCellMar>
-            <w:top w:w="0" w:type="dxa"/>
-            <w:bottom w:w="0" w:type="dxa"/>
-          </w:tblCellMar>
-        </w:tblPrEx>
         <w:tc>
           <w:tcPr>
             <w:tcW w:w="0" w:type="auto"/>
@@ -961,12 +919,6 @@
         </w:tc>
       </w:tr>
       <w:tr>
-        <w:tblPrEx>
-          <w:tblCellMar>
-            <w:top w:w="0" w:type="dxa"/>
-            <w:bottom w:w="0" w:type="dxa"/>
-          </w:tblCellMar>
-        </w:tblPrEx>
         <w:tc>
           <w:tcPr>
             <w:tcW w:w="0" w:type="auto"/>
@@ -994,37 +946,25 @@
         </w:tc>
       </w:tr>
       <w:tr>
-        <w:tblPrEx>
-          <w:tblCellMar>
-            <w:top w:w="0" w:type="dxa"/>
-            <w:bottom w:w="0" w:type="dxa"/>
-          </w:tblCellMar>
-        </w:tblPrEx>
-        <w:tc>
-          <w:tcPr>
-            <w:tcW w:w="0" w:type="auto"/>
-            <w:shd w:val="solid" w:color="F2F2F2" w:fill="F2F2F2"/>
-            <w:tcMar>
-              <w:top w:w="20" w:type="dxa"/>
-              <w:left w:w="120" w:type="dxa"/>
-              <w:bottom w:w="20" w:type="dxa"/>
-              <w:right w:w="120" w:type="dxa"/>
-            </w:tcMar>
-          </w:tcPr>
-          <w:p>
-            <w:pPr>
-              <w:spacing w:line="276" w:lineRule="auto"/>
-            </w:pPr>
-          </w:p>
-        </w:tc>
-      </w:tr>
-      <w:tr>
-        <w:tblPrEx>
-          <w:tblCellMar>
-            <w:top w:w="0" w:type="dxa"/>
-            <w:bottom w:w="0" w:type="dxa"/>
-          </w:tblCellMar>
-        </w:tblPrEx>
+        <w:tc>
+          <w:tcPr>
+            <w:tcW w:w="0" w:type="auto"/>
+            <w:shd w:val="solid" w:color="F2F2F2" w:fill="F2F2F2"/>
+            <w:tcMar>
+              <w:top w:w="20" w:type="dxa"/>
+              <w:left w:w="120" w:type="dxa"/>
+              <w:bottom w:w="20" w:type="dxa"/>
+              <w:right w:w="120" w:type="dxa"/>
+            </w:tcMar>
+          </w:tcPr>
+          <w:p>
+            <w:pPr>
+              <w:spacing w:line="276" w:lineRule="auto"/>
+            </w:pPr>
+          </w:p>
+        </w:tc>
+      </w:tr>
+      <w:tr>
         <w:tc>
           <w:tcPr>
             <w:tcW w:w="0" w:type="auto"/>
@@ -1052,12 +992,6 @@
         </w:tc>
       </w:tr>
       <w:tr>
-        <w:tblPrEx>
-          <w:tblCellMar>
-            <w:top w:w="0" w:type="dxa"/>
-            <w:bottom w:w="0" w:type="dxa"/>
-          </w:tblCellMar>
-        </w:tblPrEx>
         <w:tc>
           <w:tcPr>
             <w:tcW w:w="0" w:type="auto"/>
@@ -1085,12 +1019,6 @@
         </w:tc>
       </w:tr>
       <w:tr>
-        <w:tblPrEx>
-          <w:tblCellMar>
-            <w:top w:w="0" w:type="dxa"/>
-            <w:bottom w:w="0" w:type="dxa"/>
-          </w:tblCellMar>
-        </w:tblPrEx>
         <w:tc>
           <w:tcPr>
             <w:tcW w:w="0" w:type="auto"/>
@@ -1118,12 +1046,6 @@
         </w:tc>
       </w:tr>
       <w:tr>
-        <w:tblPrEx>
-          <w:tblCellMar>
-            <w:top w:w="0" w:type="dxa"/>
-            <w:bottom w:w="0" w:type="dxa"/>
-          </w:tblCellMar>
-        </w:tblPrEx>
         <w:tc>
           <w:tcPr>
             <w:tcW w:w="0" w:type="auto"/>
@@ -1151,12 +1073,6 @@
         </w:tc>
       </w:tr>
       <w:tr>
-        <w:tblPrEx>
-          <w:tblCellMar>
-            <w:top w:w="0" w:type="dxa"/>
-            <w:bottom w:w="0" w:type="dxa"/>
-          </w:tblCellMar>
-        </w:tblPrEx>
         <w:tc>
           <w:tcPr>
             <w:tcW w:w="0" w:type="auto"/>
@@ -1184,12 +1100,6 @@
         </w:tc>
       </w:tr>
       <w:tr>
-        <w:tblPrEx>
-          <w:tblCellMar>
-            <w:top w:w="0" w:type="dxa"/>
-            <w:bottom w:w="0" w:type="dxa"/>
-          </w:tblCellMar>
-        </w:tblPrEx>
         <w:tc>
           <w:tcPr>
             <w:tcW w:w="0" w:type="auto"/>
@@ -1368,12 +1278,6 @@
         <w:gridCol w:w="9354"/>
       </w:tblGrid>
       <w:tr>
-        <w:tblPrEx>
-          <w:tblCellMar>
-            <w:top w:w="0" w:type="dxa"/>
-            <w:bottom w:w="0" w:type="dxa"/>
-          </w:tblCellMar>
-        </w:tblPrEx>
         <w:tc>
           <w:tcPr>
             <w:tcW w:w="0" w:type="auto"/>
@@ -1401,12 +1305,6 @@
         </w:tc>
       </w:tr>
       <w:tr>
-        <w:tblPrEx>
-          <w:tblCellMar>
-            <w:top w:w="0" w:type="dxa"/>
-            <w:bottom w:w="0" w:type="dxa"/>
-          </w:tblCellMar>
-        </w:tblPrEx>
         <w:tc>
           <w:tcPr>
             <w:tcW w:w="0" w:type="auto"/>
@@ -1434,12 +1332,6 @@
         </w:tc>
       </w:tr>
       <w:tr>
-        <w:tblPrEx>
-          <w:tblCellMar>
-            <w:top w:w="0" w:type="dxa"/>
-            <w:bottom w:w="0" w:type="dxa"/>
-          </w:tblCellMar>
-        </w:tblPrEx>
         <w:tc>
           <w:tcPr>
             <w:tcW w:w="0" w:type="auto"/>
@@ -1467,12 +1359,6 @@
         </w:tc>
       </w:tr>
       <w:tr>
-        <w:tblPrEx>
-          <w:tblCellMar>
-            <w:top w:w="0" w:type="dxa"/>
-            <w:bottom w:w="0" w:type="dxa"/>
-          </w:tblCellMar>
-        </w:tblPrEx>
         <w:tc>
           <w:tcPr>
             <w:tcW w:w="0" w:type="auto"/>
@@ -1500,12 +1386,6 @@
         </w:tc>
       </w:tr>
       <w:tr>
-        <w:tblPrEx>
-          <w:tblCellMar>
-            <w:top w:w="0" w:type="dxa"/>
-            <w:bottom w:w="0" w:type="dxa"/>
-          </w:tblCellMar>
-        </w:tblPrEx>
         <w:tc>
           <w:tcPr>
             <w:tcW w:w="0" w:type="auto"/>
@@ -1533,12 +1413,6 @@
         </w:tc>
       </w:tr>
       <w:tr>
-        <w:tblPrEx>
-          <w:tblCellMar>
-            <w:top w:w="0" w:type="dxa"/>
-            <w:bottom w:w="0" w:type="dxa"/>
-          </w:tblCellMar>
-        </w:tblPrEx>
         <w:tc>
           <w:tcPr>
             <w:tcW w:w="0" w:type="auto"/>
@@ -1566,12 +1440,6 @@
         </w:tc>
       </w:tr>
       <w:tr>
-        <w:tblPrEx>
-          <w:tblCellMar>
-            <w:top w:w="0" w:type="dxa"/>
-            <w:bottom w:w="0" w:type="dxa"/>
-          </w:tblCellMar>
-        </w:tblPrEx>
         <w:tc>
           <w:tcPr>
             <w:tcW w:w="0" w:type="auto"/>
@@ -1720,12 +1588,6 @@
         <w:gridCol w:w="9354"/>
       </w:tblGrid>
       <w:tr>
-        <w:tblPrEx>
-          <w:tblCellMar>
-            <w:top w:w="0" w:type="dxa"/>
-            <w:bottom w:w="0" w:type="dxa"/>
-          </w:tblCellMar>
-        </w:tblPrEx>
         <w:tc>
           <w:tcPr>
             <w:tcW w:w="0" w:type="auto"/>
@@ -1753,12 +1615,6 @@
         </w:tc>
       </w:tr>
       <w:tr>
-        <w:tblPrEx>
-          <w:tblCellMar>
-            <w:top w:w="0" w:type="dxa"/>
-            <w:bottom w:w="0" w:type="dxa"/>
-          </w:tblCellMar>
-        </w:tblPrEx>
         <w:tc>
           <w:tcPr>
             <w:tcW w:w="0" w:type="auto"/>
@@ -1786,12 +1642,6 @@
         </w:tc>
       </w:tr>
       <w:tr>
-        <w:tblPrEx>
-          <w:tblCellMar>
-            <w:top w:w="0" w:type="dxa"/>
-            <w:bottom w:w="0" w:type="dxa"/>
-          </w:tblCellMar>
-        </w:tblPrEx>
         <w:tc>
           <w:tcPr>
             <w:tcW w:w="0" w:type="auto"/>
@@ -1819,12 +1669,6 @@
         </w:tc>
       </w:tr>
       <w:tr>
-        <w:tblPrEx>
-          <w:tblCellMar>
-            <w:top w:w="0" w:type="dxa"/>
-            <w:bottom w:w="0" w:type="dxa"/>
-          </w:tblCellMar>
-        </w:tblPrEx>
         <w:tc>
           <w:tcPr>
             <w:tcW w:w="0" w:type="auto"/>
@@ -1852,37 +1696,25 @@
         </w:tc>
       </w:tr>
       <w:tr>
-        <w:tblPrEx>
-          <w:tblCellMar>
-            <w:top w:w="0" w:type="dxa"/>
-            <w:bottom w:w="0" w:type="dxa"/>
-          </w:tblCellMar>
-        </w:tblPrEx>
-        <w:tc>
-          <w:tcPr>
-            <w:tcW w:w="0" w:type="auto"/>
-            <w:shd w:val="solid" w:color="F2F2F2" w:fill="F2F2F2"/>
-            <w:tcMar>
-              <w:top w:w="20" w:type="dxa"/>
-              <w:left w:w="120" w:type="dxa"/>
-              <w:bottom w:w="20" w:type="dxa"/>
-              <w:right w:w="120" w:type="dxa"/>
-            </w:tcMar>
-          </w:tcPr>
-          <w:p>
-            <w:pPr>
-              <w:spacing w:line="276" w:lineRule="auto"/>
-            </w:pPr>
-          </w:p>
-        </w:tc>
-      </w:tr>
-      <w:tr>
-        <w:tblPrEx>
-          <w:tblCellMar>
-            <w:top w:w="0" w:type="dxa"/>
-            <w:bottom w:w="0" w:type="dxa"/>
-          </w:tblCellMar>
-        </w:tblPrEx>
+        <w:tc>
+          <w:tcPr>
+            <w:tcW w:w="0" w:type="auto"/>
+            <w:shd w:val="solid" w:color="F2F2F2" w:fill="F2F2F2"/>
+            <w:tcMar>
+              <w:top w:w="20" w:type="dxa"/>
+              <w:left w:w="120" w:type="dxa"/>
+              <w:bottom w:w="20" w:type="dxa"/>
+              <w:right w:w="120" w:type="dxa"/>
+            </w:tcMar>
+          </w:tcPr>
+          <w:p>
+            <w:pPr>
+              <w:spacing w:line="276" w:lineRule="auto"/>
+            </w:pPr>
+          </w:p>
+        </w:tc>
+      </w:tr>
+      <w:tr>
         <w:tc>
           <w:tcPr>
             <w:tcW w:w="0" w:type="auto"/>
@@ -1910,12 +1742,6 @@
         </w:tc>
       </w:tr>
       <w:tr>
-        <w:tblPrEx>
-          <w:tblCellMar>
-            <w:top w:w="0" w:type="dxa"/>
-            <w:bottom w:w="0" w:type="dxa"/>
-          </w:tblCellMar>
-        </w:tblPrEx>
         <w:tc>
           <w:tcPr>
             <w:tcW w:w="0" w:type="auto"/>
@@ -1943,12 +1769,6 @@
         </w:tc>
       </w:tr>
       <w:tr>
-        <w:tblPrEx>
-          <w:tblCellMar>
-            <w:top w:w="0" w:type="dxa"/>
-            <w:bottom w:w="0" w:type="dxa"/>
-          </w:tblCellMar>
-        </w:tblPrEx>
         <w:tc>
           <w:tcPr>
             <w:tcW w:w="0" w:type="auto"/>
@@ -1977,12 +1797,6 @@
         </w:tc>
       </w:tr>
       <w:tr>
-        <w:tblPrEx>
-          <w:tblCellMar>
-            <w:top w:w="0" w:type="dxa"/>
-            <w:bottom w:w="0" w:type="dxa"/>
-          </w:tblCellMar>
-        </w:tblPrEx>
         <w:tc>
           <w:tcPr>
             <w:tcW w:w="0" w:type="auto"/>
@@ -2173,12 +1987,6 @@
         <w:gridCol w:w="9354"/>
       </w:tblGrid>
       <w:tr>
-        <w:tblPrEx>
-          <w:tblCellMar>
-            <w:top w:w="0" w:type="dxa"/>
-            <w:bottom w:w="0" w:type="dxa"/>
-          </w:tblCellMar>
-        </w:tblPrEx>
         <w:tc>
           <w:tcPr>
             <w:tcW w:w="0" w:type="auto"/>
@@ -2206,12 +2014,6 @@
         </w:tc>
       </w:tr>
       <w:tr>
-        <w:tblPrEx>
-          <w:tblCellMar>
-            <w:top w:w="0" w:type="dxa"/>
-            <w:bottom w:w="0" w:type="dxa"/>
-          </w:tblCellMar>
-        </w:tblPrEx>
         <w:tc>
           <w:tcPr>
             <w:tcW w:w="0" w:type="auto"/>
@@ -2239,37 +2041,25 @@
         </w:tc>
       </w:tr>
       <w:tr>
-        <w:tblPrEx>
-          <w:tblCellMar>
-            <w:top w:w="0" w:type="dxa"/>
-            <w:bottom w:w="0" w:type="dxa"/>
-          </w:tblCellMar>
-        </w:tblPrEx>
-        <w:tc>
-          <w:tcPr>
-            <w:tcW w:w="0" w:type="auto"/>
-            <w:shd w:val="solid" w:color="F2F2F2" w:fill="F2F2F2"/>
-            <w:tcMar>
-              <w:top w:w="20" w:type="dxa"/>
-              <w:left w:w="120" w:type="dxa"/>
-              <w:bottom w:w="20" w:type="dxa"/>
-              <w:right w:w="120" w:type="dxa"/>
-            </w:tcMar>
-          </w:tcPr>
-          <w:p>
-            <w:pPr>
-              <w:spacing w:line="276" w:lineRule="auto"/>
-            </w:pPr>
-          </w:p>
-        </w:tc>
-      </w:tr>
-      <w:tr>
-        <w:tblPrEx>
-          <w:tblCellMar>
-            <w:top w:w="0" w:type="dxa"/>
-            <w:bottom w:w="0" w:type="dxa"/>
-          </w:tblCellMar>
-        </w:tblPrEx>
+        <w:tc>
+          <w:tcPr>
+            <w:tcW w:w="0" w:type="auto"/>
+            <w:shd w:val="solid" w:color="F2F2F2" w:fill="F2F2F2"/>
+            <w:tcMar>
+              <w:top w:w="20" w:type="dxa"/>
+              <w:left w:w="120" w:type="dxa"/>
+              <w:bottom w:w="20" w:type="dxa"/>
+              <w:right w:w="120" w:type="dxa"/>
+            </w:tcMar>
+          </w:tcPr>
+          <w:p>
+            <w:pPr>
+              <w:spacing w:line="276" w:lineRule="auto"/>
+            </w:pPr>
+          </w:p>
+        </w:tc>
+      </w:tr>
+      <w:tr>
         <w:tc>
           <w:tcPr>
             <w:tcW w:w="0" w:type="auto"/>
@@ -2297,12 +2087,6 @@
         </w:tc>
       </w:tr>
       <w:tr>
-        <w:tblPrEx>
-          <w:tblCellMar>
-            <w:top w:w="0" w:type="dxa"/>
-            <w:bottom w:w="0" w:type="dxa"/>
-          </w:tblCellMar>
-        </w:tblPrEx>
         <w:tc>
           <w:tcPr>
             <w:tcW w:w="0" w:type="auto"/>
@@ -2330,12 +2114,6 @@
         </w:tc>
       </w:tr>
       <w:tr>
-        <w:tblPrEx>
-          <w:tblCellMar>
-            <w:top w:w="0" w:type="dxa"/>
-            <w:bottom w:w="0" w:type="dxa"/>
-          </w:tblCellMar>
-        </w:tblPrEx>
         <w:tc>
           <w:tcPr>
             <w:tcW w:w="0" w:type="auto"/>
@@ -2363,12 +2141,6 @@
         </w:tc>
       </w:tr>
       <w:tr>
-        <w:tblPrEx>
-          <w:tblCellMar>
-            <w:top w:w="0" w:type="dxa"/>
-            <w:bottom w:w="0" w:type="dxa"/>
-          </w:tblCellMar>
-        </w:tblPrEx>
         <w:tc>
           <w:tcPr>
             <w:tcW w:w="0" w:type="auto"/>
@@ -2396,12 +2168,6 @@
         </w:tc>
       </w:tr>
       <w:tr>
-        <w:tblPrEx>
-          <w:tblCellMar>
-            <w:top w:w="0" w:type="dxa"/>
-            <w:bottom w:w="0" w:type="dxa"/>
-          </w:tblCellMar>
-        </w:tblPrEx>
         <w:tc>
           <w:tcPr>
             <w:tcW w:w="0" w:type="auto"/>
@@ -2429,12 +2195,6 @@
         </w:tc>
       </w:tr>
       <w:tr>
-        <w:tblPrEx>
-          <w:tblCellMar>
-            <w:top w:w="0" w:type="dxa"/>
-            <w:bottom w:w="0" w:type="dxa"/>
-          </w:tblCellMar>
-        </w:tblPrEx>
         <w:tc>
           <w:tcPr>
             <w:tcW w:w="0" w:type="auto"/>
@@ -2556,12 +2316,6 @@
         <w:gridCol w:w="9354"/>
       </w:tblGrid>
       <w:tr>
-        <w:tblPrEx>
-          <w:tblCellMar>
-            <w:top w:w="0" w:type="dxa"/>
-            <w:bottom w:w="0" w:type="dxa"/>
-          </w:tblCellMar>
-        </w:tblPrEx>
         <w:tc>
           <w:tcPr>
             <w:tcW w:w="0" w:type="auto"/>
@@ -2589,12 +2343,6 @@
         </w:tc>
       </w:tr>
       <w:tr>
-        <w:tblPrEx>
-          <w:tblCellMar>
-            <w:top w:w="0" w:type="dxa"/>
-            <w:bottom w:w="0" w:type="dxa"/>
-          </w:tblCellMar>
-        </w:tblPrEx>
         <w:tc>
           <w:tcPr>
             <w:tcW w:w="0" w:type="auto"/>
@@ -2622,12 +2370,6 @@
         </w:tc>
       </w:tr>
       <w:tr>
-        <w:tblPrEx>
-          <w:tblCellMar>
-            <w:top w:w="0" w:type="dxa"/>
-            <w:bottom w:w="0" w:type="dxa"/>
-          </w:tblCellMar>
-        </w:tblPrEx>
         <w:tc>
           <w:tcPr>
             <w:tcW w:w="0" w:type="auto"/>
@@ -2853,12 +2595,6 @@
         <w:gridCol w:w="9354"/>
       </w:tblGrid>
       <w:tr>
-        <w:tblPrEx>
-          <w:tblCellMar>
-            <w:top w:w="0" w:type="dxa"/>
-            <w:bottom w:w="0" w:type="dxa"/>
-          </w:tblCellMar>
-        </w:tblPrEx>
         <w:tc>
           <w:tcPr>
             <w:tcW w:w="0" w:type="auto"/>
@@ -2886,12 +2622,6 @@
         </w:tc>
       </w:tr>
       <w:tr>
-        <w:tblPrEx>
-          <w:tblCellMar>
-            <w:top w:w="0" w:type="dxa"/>
-            <w:bottom w:w="0" w:type="dxa"/>
-          </w:tblCellMar>
-        </w:tblPrEx>
         <w:tc>
           <w:tcPr>
             <w:tcW w:w="0" w:type="auto"/>
@@ -2919,12 +2649,6 @@
         </w:tc>
       </w:tr>
       <w:tr>
-        <w:tblPrEx>
-          <w:tblCellMar>
-            <w:top w:w="0" w:type="dxa"/>
-            <w:bottom w:w="0" w:type="dxa"/>
-          </w:tblCellMar>
-        </w:tblPrEx>
         <w:tc>
           <w:tcPr>
             <w:tcW w:w="0" w:type="auto"/>
@@ -2952,12 +2676,6 @@
         </w:tc>
       </w:tr>
       <w:tr>
-        <w:tblPrEx>
-          <w:tblCellMar>
-            <w:top w:w="0" w:type="dxa"/>
-            <w:bottom w:w="0" w:type="dxa"/>
-          </w:tblCellMar>
-        </w:tblPrEx>
         <w:tc>
           <w:tcPr>
             <w:tcW w:w="0" w:type="auto"/>
@@ -2985,12 +2703,6 @@
         </w:tc>
       </w:tr>
       <w:tr>
-        <w:tblPrEx>
-          <w:tblCellMar>
-            <w:top w:w="0" w:type="dxa"/>
-            <w:bottom w:w="0" w:type="dxa"/>
-          </w:tblCellMar>
-        </w:tblPrEx>
         <w:tc>
           <w:tcPr>
             <w:tcW w:w="0" w:type="auto"/>
@@ -3018,12 +2730,6 @@
         </w:tc>
       </w:tr>
       <w:tr>
-        <w:tblPrEx>
-          <w:tblCellMar>
-            <w:top w:w="0" w:type="dxa"/>
-            <w:bottom w:w="0" w:type="dxa"/>
-          </w:tblCellMar>
-        </w:tblPrEx>
         <w:tc>
           <w:tcPr>
             <w:tcW w:w="0" w:type="auto"/>
@@ -3051,37 +2757,25 @@
         </w:tc>
       </w:tr>
       <w:tr>
-        <w:tblPrEx>
-          <w:tblCellMar>
-            <w:top w:w="0" w:type="dxa"/>
-            <w:bottom w:w="0" w:type="dxa"/>
-          </w:tblCellMar>
-        </w:tblPrEx>
-        <w:tc>
-          <w:tcPr>
-            <w:tcW w:w="0" w:type="auto"/>
-            <w:shd w:val="solid" w:color="F2F2F2" w:fill="F2F2F2"/>
-            <w:tcMar>
-              <w:top w:w="20" w:type="dxa"/>
-              <w:left w:w="120" w:type="dxa"/>
-              <w:bottom w:w="20" w:type="dxa"/>
-              <w:right w:w="120" w:type="dxa"/>
-            </w:tcMar>
-          </w:tcPr>
-          <w:p>
-            <w:pPr>
-              <w:spacing w:line="276" w:lineRule="auto"/>
-            </w:pPr>
-          </w:p>
-        </w:tc>
-      </w:tr>
-      <w:tr>
-        <w:tblPrEx>
-          <w:tblCellMar>
-            <w:top w:w="0" w:type="dxa"/>
-            <w:bottom w:w="0" w:type="dxa"/>
-          </w:tblCellMar>
-        </w:tblPrEx>
+        <w:tc>
+          <w:tcPr>
+            <w:tcW w:w="0" w:type="auto"/>
+            <w:shd w:val="solid" w:color="F2F2F2" w:fill="F2F2F2"/>
+            <w:tcMar>
+              <w:top w:w="20" w:type="dxa"/>
+              <w:left w:w="120" w:type="dxa"/>
+              <w:bottom w:w="20" w:type="dxa"/>
+              <w:right w:w="120" w:type="dxa"/>
+            </w:tcMar>
+          </w:tcPr>
+          <w:p>
+            <w:pPr>
+              <w:spacing w:line="276" w:lineRule="auto"/>
+            </w:pPr>
+          </w:p>
+        </w:tc>
+      </w:tr>
+      <w:tr>
         <w:tc>
           <w:tcPr>
             <w:tcW w:w="0" w:type="auto"/>
@@ -3109,12 +2803,6 @@
         </w:tc>
       </w:tr>
       <w:tr>
-        <w:tblPrEx>
-          <w:tblCellMar>
-            <w:top w:w="0" w:type="dxa"/>
-            <w:bottom w:w="0" w:type="dxa"/>
-          </w:tblCellMar>
-        </w:tblPrEx>
         <w:tc>
           <w:tcPr>
             <w:tcW w:w="0" w:type="auto"/>
@@ -3142,12 +2830,6 @@
         </w:tc>
       </w:tr>
       <w:tr>
-        <w:tblPrEx>
-          <w:tblCellMar>
-            <w:top w:w="0" w:type="dxa"/>
-            <w:bottom w:w="0" w:type="dxa"/>
-          </w:tblCellMar>
-        </w:tblPrEx>
         <w:tc>
           <w:tcPr>
             <w:tcW w:w="0" w:type="auto"/>
@@ -3175,12 +2857,6 @@
         </w:tc>
       </w:tr>
       <w:tr>
-        <w:tblPrEx>
-          <w:tblCellMar>
-            <w:top w:w="0" w:type="dxa"/>
-            <w:bottom w:w="0" w:type="dxa"/>
-          </w:tblCellMar>
-        </w:tblPrEx>
         <w:tc>
           <w:tcPr>
             <w:tcW w:w="0" w:type="auto"/>
@@ -3208,12 +2884,6 @@
         </w:tc>
       </w:tr>
       <w:tr>
-        <w:tblPrEx>
-          <w:tblCellMar>
-            <w:top w:w="0" w:type="dxa"/>
-            <w:bottom w:w="0" w:type="dxa"/>
-          </w:tblCellMar>
-        </w:tblPrEx>
         <w:tc>
           <w:tcPr>
             <w:tcW w:w="0" w:type="auto"/>
@@ -3241,12 +2911,6 @@
         </w:tc>
       </w:tr>
       <w:tr>
-        <w:tblPrEx>
-          <w:tblCellMar>
-            <w:top w:w="0" w:type="dxa"/>
-            <w:bottom w:w="0" w:type="dxa"/>
-          </w:tblCellMar>
-        </w:tblPrEx>
         <w:tc>
           <w:tcPr>
             <w:tcW w:w="0" w:type="auto"/>
@@ -3274,12 +2938,6 @@
         </w:tc>
       </w:tr>
       <w:tr>
-        <w:tblPrEx>
-          <w:tblCellMar>
-            <w:top w:w="0" w:type="dxa"/>
-            <w:bottom w:w="0" w:type="dxa"/>
-          </w:tblCellMar>
-        </w:tblPrEx>
         <w:tc>
           <w:tcPr>
             <w:tcW w:w="0" w:type="auto"/>
@@ -3307,37 +2965,25 @@
         </w:tc>
       </w:tr>
       <w:tr>
-        <w:tblPrEx>
-          <w:tblCellMar>
-            <w:top w:w="0" w:type="dxa"/>
-            <w:bottom w:w="0" w:type="dxa"/>
-          </w:tblCellMar>
-        </w:tblPrEx>
-        <w:tc>
-          <w:tcPr>
-            <w:tcW w:w="0" w:type="auto"/>
-            <w:shd w:val="solid" w:color="F2F2F2" w:fill="F2F2F2"/>
-            <w:tcMar>
-              <w:top w:w="20" w:type="dxa"/>
-              <w:left w:w="120" w:type="dxa"/>
-              <w:bottom w:w="20" w:type="dxa"/>
-              <w:right w:w="120" w:type="dxa"/>
-            </w:tcMar>
-          </w:tcPr>
-          <w:p>
-            <w:pPr>
-              <w:spacing w:line="276" w:lineRule="auto"/>
-            </w:pPr>
-          </w:p>
-        </w:tc>
-      </w:tr>
-      <w:tr>
-        <w:tblPrEx>
-          <w:tblCellMar>
-            <w:top w:w="0" w:type="dxa"/>
-            <w:bottom w:w="0" w:type="dxa"/>
-          </w:tblCellMar>
-        </w:tblPrEx>
+        <w:tc>
+          <w:tcPr>
+            <w:tcW w:w="0" w:type="auto"/>
+            <w:shd w:val="solid" w:color="F2F2F2" w:fill="F2F2F2"/>
+            <w:tcMar>
+              <w:top w:w="20" w:type="dxa"/>
+              <w:left w:w="120" w:type="dxa"/>
+              <w:bottom w:w="20" w:type="dxa"/>
+              <w:right w:w="120" w:type="dxa"/>
+            </w:tcMar>
+          </w:tcPr>
+          <w:p>
+            <w:pPr>
+              <w:spacing w:line="276" w:lineRule="auto"/>
+            </w:pPr>
+          </w:p>
+        </w:tc>
+      </w:tr>
+      <w:tr>
         <w:tc>
           <w:tcPr>
             <w:tcW w:w="0" w:type="auto"/>
@@ -3365,12 +3011,6 @@
         </w:tc>
       </w:tr>
       <w:tr>
-        <w:tblPrEx>
-          <w:tblCellMar>
-            <w:top w:w="0" w:type="dxa"/>
-            <w:bottom w:w="0" w:type="dxa"/>
-          </w:tblCellMar>
-        </w:tblPrEx>
         <w:tc>
           <w:tcPr>
             <w:tcW w:w="0" w:type="auto"/>
@@ -3398,12 +3038,6 @@
         </w:tc>
       </w:tr>
       <w:tr>
-        <w:tblPrEx>
-          <w:tblCellMar>
-            <w:top w:w="0" w:type="dxa"/>
-            <w:bottom w:w="0" w:type="dxa"/>
-          </w:tblCellMar>
-        </w:tblPrEx>
         <w:tc>
           <w:tcPr>
             <w:tcW w:w="0" w:type="auto"/>
@@ -3431,12 +3065,6 @@
         </w:tc>
       </w:tr>
       <w:tr>
-        <w:tblPrEx>
-          <w:tblCellMar>
-            <w:top w:w="0" w:type="dxa"/>
-            <w:bottom w:w="0" w:type="dxa"/>
-          </w:tblCellMar>
-        </w:tblPrEx>
         <w:tc>
           <w:tcPr>
             <w:tcW w:w="0" w:type="auto"/>
@@ -3464,12 +3092,6 @@
         </w:tc>
       </w:tr>
       <w:tr>
-        <w:tblPrEx>
-          <w:tblCellMar>
-            <w:top w:w="0" w:type="dxa"/>
-            <w:bottom w:w="0" w:type="dxa"/>
-          </w:tblCellMar>
-        </w:tblPrEx>
         <w:tc>
           <w:tcPr>
             <w:tcW w:w="0" w:type="auto"/>
@@ -3745,12 +3367,6 @@
         <w:gridCol w:w="4954"/>
       </w:tblGrid>
       <w:tr>
-        <w:tblPrEx>
-          <w:tblCellMar>
-            <w:top w:w="0" w:type="dxa"/>
-            <w:bottom w:w="0" w:type="dxa"/>
-          </w:tblCellMar>
-        </w:tblPrEx>
         <w:tc>
           <w:tcPr>
             <w:tcW w:w="3200" w:type="dxa"/>
@@ -3840,12 +3456,6 @@
         </w:tc>
       </w:tr>
       <w:tr>
-        <w:tblPrEx>
-          <w:tblCellMar>
-            <w:top w:w="0" w:type="dxa"/>
-            <w:bottom w:w="0" w:type="dxa"/>
-          </w:tblCellMar>
-        </w:tblPrEx>
         <w:tc>
           <w:tcPr>
             <w:tcW w:w="3200" w:type="dxa"/>
@@ -3926,12 +3536,6 @@
         </w:tc>
       </w:tr>
       <w:tr>
-        <w:tblPrEx>
-          <w:tblCellMar>
-            <w:top w:w="0" w:type="dxa"/>
-            <w:bottom w:w="0" w:type="dxa"/>
-          </w:tblCellMar>
-        </w:tblPrEx>
         <w:tc>
           <w:tcPr>
             <w:tcW w:w="3200" w:type="dxa"/>
@@ -4013,12 +3617,6 @@
         </w:tc>
       </w:tr>
       <w:tr>
-        <w:tblPrEx>
-          <w:tblCellMar>
-            <w:top w:w="0" w:type="dxa"/>
-            <w:bottom w:w="0" w:type="dxa"/>
-          </w:tblCellMar>
-        </w:tblPrEx>
         <w:tc>
           <w:tcPr>
             <w:tcW w:w="3200" w:type="dxa"/>
@@ -4099,12 +3697,6 @@
         </w:tc>
       </w:tr>
       <w:tr>
-        <w:tblPrEx>
-          <w:tblCellMar>
-            <w:top w:w="0" w:type="dxa"/>
-            <w:bottom w:w="0" w:type="dxa"/>
-          </w:tblCellMar>
-        </w:tblPrEx>
         <w:tc>
           <w:tcPr>
             <w:tcW w:w="3200" w:type="dxa"/>
@@ -4185,12 +3777,6 @@
         </w:tc>
       </w:tr>
       <w:tr>
-        <w:tblPrEx>
-          <w:tblCellMar>
-            <w:top w:w="0" w:type="dxa"/>
-            <w:bottom w:w="0" w:type="dxa"/>
-          </w:tblCellMar>
-        </w:tblPrEx>
         <w:tc>
           <w:tcPr>
             <w:tcW w:w="3200" w:type="dxa"/>
@@ -4271,12 +3857,6 @@
         </w:tc>
       </w:tr>
       <w:tr>
-        <w:tblPrEx>
-          <w:tblCellMar>
-            <w:top w:w="0" w:type="dxa"/>
-            <w:bottom w:w="0" w:type="dxa"/>
-          </w:tblCellMar>
-        </w:tblPrEx>
         <w:tc>
           <w:tcPr>
             <w:tcW w:w="3200" w:type="dxa"/>
@@ -4357,12 +3937,6 @@
         </w:tc>
       </w:tr>
       <w:tr>
-        <w:tblPrEx>
-          <w:tblCellMar>
-            <w:top w:w="0" w:type="dxa"/>
-            <w:bottom w:w="0" w:type="dxa"/>
-          </w:tblCellMar>
-        </w:tblPrEx>
         <w:tc>
           <w:tcPr>
             <w:tcW w:w="3200" w:type="dxa"/>
@@ -4575,12 +4149,6 @@
       <w:gridCol w:w="2127"/>
     </w:tblGrid>
     <w:tr>
-      <w:tblPrEx>
-        <w:tblCellMar>
-          <w:top w:w="0" w:type="dxa"/>
-          <w:bottom w:w="0" w:type="dxa"/>
-        </w:tblCellMar>
-      </w:tblPrEx>
       <w:trPr>
         <w:trHeight w:hRule="exact" w:val="707"/>
       </w:trPr>
@@ -4601,7 +4169,7 @@
               <w:noProof/>
             </w:rPr>
             <w:drawing>
-              <wp:inline distT="0" distB="0" distL="0" distR="0">
+              <wp:inline distT="0" distB="0" distL="0" distR="0" wp14:anchorId="594CA792" wp14:editId="6CC57024">
                 <wp:extent cx="542925" cy="361950"/>
                 <wp:effectExtent l="0" t="0" r="0" b="0"/>
                 <wp:docPr id="133958807" name="Picture 133958807"/>
@@ -4751,7 +4319,7 @@
         <w:noProof/>
       </w:rPr>
       <w:drawing>
-        <wp:inline distT="0" distB="0" distL="0" distR="0">
+        <wp:inline distT="0" distB="0" distL="0" distR="0" wp14:anchorId="029F6C35" wp14:editId="3906EA06">
           <wp:extent cx="1590675" cy="400050"/>
           <wp:effectExtent l="0" t="0" r="0" b="0"/>
           <wp:docPr id="1" name="Picture 1"/>
@@ -5483,6 +5051,48 @@
       <w:szCs w:val="20"/>
     </w:rPr>
   </w:style>
+  <w:style w:type="paragraph" w:styleId="Header">
+    <w:name w:val="header"/>
+    <w:basedOn w:val="Normal"/>
+    <w:link w:val="HeaderChar"/>
+    <w:uiPriority w:val="99"/>
+    <w:unhideWhenUsed/>
+    <w:rsid w:val="00AC5073"/>
+    <w:pPr>
+      <w:tabs>
+        <w:tab w:val="center" w:pos="4513"/>
+        <w:tab w:val="right" w:pos="9026"/>
+      </w:tabs>
+    </w:pPr>
+  </w:style>
+  <w:style w:type="character" w:customStyle="1" w:styleId="HeaderChar">
+    <w:name w:val="Header Char"/>
+    <w:basedOn w:val="DefaultParagraphFont"/>
+    <w:link w:val="Header"/>
+    <w:uiPriority w:val="99"/>
+    <w:rsid w:val="00AC5073"/>
+  </w:style>
+  <w:style w:type="paragraph" w:styleId="Footer">
+    <w:name w:val="footer"/>
+    <w:basedOn w:val="Normal"/>
+    <w:link w:val="FooterChar"/>
+    <w:uiPriority w:val="99"/>
+    <w:unhideWhenUsed/>
+    <w:rsid w:val="00AC5073"/>
+    <w:pPr>
+      <w:tabs>
+        <w:tab w:val="center" w:pos="4513"/>
+        <w:tab w:val="right" w:pos="9026"/>
+      </w:tabs>
+    </w:pPr>
+  </w:style>
+  <w:style w:type="character" w:customStyle="1" w:styleId="FooterChar">
+    <w:name w:val="Footer Char"/>
+    <w:basedOn w:val="DefaultParagraphFont"/>
+    <w:link w:val="Footer"/>
+    <w:uiPriority w:val="99"/>
+    <w:rsid w:val="00AC5073"/>
+  </w:style>
 </w:styles>
 </file>
 

</xml_diff>